<commit_message>
Embed all eight figures in the final report
The Factual section now shows the visual evidence inline, not just by
filename: the top-gap bar chart, both county choropleths, the state cartogram,
the need-versus-capacity scatter, the gap-score distribution, the Spearman
correlation heatmap, and the per-state truncation-bias chart, each with a
numbered caption. Figures are the committed PNGs; the report stays at 4 tables
and zero em dashes.
</commit_message>
<xml_diff>
--- a/CS6365_Checkpoint4_Report.docx
+++ b/CS6365_Checkpoint4_Report.docx
@@ -4373,23 +4373,460 @@
     </w:p>
     <w:p>
       <w:pPr>
-        <w:spacing w:after="120"/>
+        <w:spacing w:before="160" w:after="40"/>
       </w:pPr>
       <w:r>
         <w:rPr>
           <w:rFonts w:ascii="Times New Roman" w:hAnsi="Times New Roman"/>
           <w:b/>
-          <w:sz w:val="22"/>
+          <w:sz w:val="24"/>
         </w:rPr>
-        <w:t xml:space="preserve">Committed figures: </w:t>
+        <w:t>Figures (committed to data/output/figures/)</w:t>
       </w:r>
+    </w:p>
+    <w:p>
+      <w:pPr>
+        <w:spacing w:after="120"/>
+      </w:pPr>
       <w:r>
         <w:rPr>
           <w:rFonts w:ascii="Times New Roman" w:hAnsi="Times New Roman"/>
           <w:b w:val="0"/>
           <w:sz w:val="22"/>
         </w:rPr>
-        <w:t>data/output/figures/ holds the top-gap bar chart (top_gap_counties.png), the need-versus-capacity scatter (need_vs_capacity.png), the gap-score distribution (gap_distribution.png), the Spearman correlation heatmap (correlation_heatmap.png), the general and food-specific county choropleths (gap_score_choropleth_county.png and food_gap_score_choropleth_county.png), the state cartogram (gap_cartogram_states.png), and the per-state truncation-bias chart (truncation_bias.png).</w:t>
+        <w:t>Every figure below is rendered by the pipeline from the committed panel and re-generated with no API key; the numbers in each match the tables above.</w:t>
+      </w:r>
+    </w:p>
+    <w:p>
+      <w:pPr>
+        <w:spacing w:before="120"/>
+        <w:jc w:val="center"/>
+      </w:pPr>
+      <w:r>
+        <w:drawing>
+          <wp:inline xmlns:a="http://schemas.openxmlformats.org/drawingml/2006/main" xmlns:pic="http://schemas.openxmlformats.org/drawingml/2006/picture">
+            <wp:extent cx="5760720" cy="5023709"/>
+            <wp:docPr id="1" name="Picture 1"/>
+            <wp:cNvGraphicFramePr>
+              <a:graphicFrameLocks noChangeAspect="1"/>
+            </wp:cNvGraphicFramePr>
+            <a:graphic>
+              <a:graphicData uri="http://schemas.openxmlformats.org/drawingml/2006/picture">
+                <pic:pic>
+                  <pic:nvPicPr>
+                    <pic:cNvPr id="0" name="top_gap_counties.png"/>
+                    <pic:cNvPicPr/>
+                  </pic:nvPicPr>
+                  <pic:blipFill>
+                    <a:blip r:embed="rId9"/>
+                    <a:stretch>
+                      <a:fillRect/>
+                    </a:stretch>
+                  </pic:blipFill>
+                  <pic:spPr>
+                    <a:xfrm>
+                      <a:off x="0" y="0"/>
+                      <a:ext cx="5760720" cy="5023709"/>
+                    </a:xfrm>
+                    <a:prstGeom prst="rect"/>
+                  </pic:spPr>
+                </pic:pic>
+              </a:graphicData>
+            </a:graphic>
+          </wp:inline>
+        </w:drawing>
+      </w:r>
+    </w:p>
+    <w:p>
+      <w:pPr>
+        <w:spacing w:after="200"/>
+        <w:jc w:val="center"/>
+      </w:pPr>
+      <w:r>
+        <w:rPr>
+          <w:rFonts w:ascii="Times New Roman" w:hAnsi="Times New Roman"/>
+          <w:i/>
+          <w:sz w:val="20"/>
+        </w:rPr>
+        <w:t>Figure 1. The highest-gap counties on the full-data panel: the Texas border, the Arkansas and Mississippi Delta, Appalachian Kentucky, and the Georgia and Alabama Black Belt.</w:t>
+      </w:r>
+    </w:p>
+    <w:p>
+      <w:pPr>
+        <w:spacing w:before="120"/>
+        <w:jc w:val="center"/>
+      </w:pPr>
+      <w:r>
+        <w:drawing>
+          <wp:inline xmlns:a="http://schemas.openxmlformats.org/drawingml/2006/main" xmlns:pic="http://schemas.openxmlformats.org/drawingml/2006/picture">
+            <wp:extent cx="5760720" cy="3873731"/>
+            <wp:docPr id="2" name="Picture 2"/>
+            <wp:cNvGraphicFramePr>
+              <a:graphicFrameLocks noChangeAspect="1"/>
+            </wp:cNvGraphicFramePr>
+            <a:graphic>
+              <a:graphicData uri="http://schemas.openxmlformats.org/drawingml/2006/picture">
+                <pic:pic>
+                  <pic:nvPicPr>
+                    <pic:cNvPr id="0" name="gap_score_choropleth_county.png"/>
+                    <pic:cNvPicPr/>
+                  </pic:nvPicPr>
+                  <pic:blipFill>
+                    <a:blip r:embed="rId10"/>
+                    <a:stretch>
+                      <a:fillRect/>
+                    </a:stretch>
+                  </pic:blipFill>
+                  <pic:spPr>
+                    <a:xfrm>
+                      <a:off x="0" y="0"/>
+                      <a:ext cx="5760720" cy="3873731"/>
+                    </a:xfrm>
+                    <a:prstGeom prst="rect"/>
+                  </pic:spPr>
+                </pic:pic>
+              </a:graphicData>
+            </a:graphic>
+          </wp:inline>
+        </w:drawing>
+      </w:r>
+    </w:p>
+    <w:p>
+      <w:pPr>
+        <w:spacing w:after="200"/>
+        <w:jc w:val="center"/>
+      </w:pPr>
+      <w:r>
+        <w:rPr>
+          <w:rFonts w:ascii="Times New Roman" w:hAnsi="Times New Roman"/>
+          <w:i/>
+          <w:sz w:val="20"/>
+        </w:rPr>
+        <w:t>Figure 2. County choropleth of the general need-capacity gap. Red is need outpacing capacity, blue the reverse, grey the auto-dropped Florida and Connecticut.</w:t>
+      </w:r>
+    </w:p>
+    <w:p>
+      <w:pPr>
+        <w:spacing w:before="120"/>
+        <w:jc w:val="center"/>
+      </w:pPr>
+      <w:r>
+        <w:drawing>
+          <wp:inline xmlns:a="http://schemas.openxmlformats.org/drawingml/2006/main" xmlns:pic="http://schemas.openxmlformats.org/drawingml/2006/picture">
+            <wp:extent cx="5760720" cy="3873731"/>
+            <wp:docPr id="3" name="Picture 3"/>
+            <wp:cNvGraphicFramePr>
+              <a:graphicFrameLocks noChangeAspect="1"/>
+            </wp:cNvGraphicFramePr>
+            <a:graphic>
+              <a:graphicData uri="http://schemas.openxmlformats.org/drawingml/2006/picture">
+                <pic:pic>
+                  <pic:nvPicPr>
+                    <pic:cNvPr id="0" name="food_gap_score_choropleth_county.png"/>
+                    <pic:cNvPicPr/>
+                  </pic:nvPicPr>
+                  <pic:blipFill>
+                    <a:blip r:embed="rId11"/>
+                    <a:stretch>
+                      <a:fillRect/>
+                    </a:stretch>
+                  </pic:blipFill>
+                  <pic:spPr>
+                    <a:xfrm>
+                      <a:off x="0" y="0"/>
+                      <a:ext cx="5760720" cy="3873731"/>
+                    </a:xfrm>
+                    <a:prstGeom prst="rect"/>
+                  </pic:spPr>
+                </pic:pic>
+              </a:graphicData>
+            </a:graphic>
+          </wp:inline>
+        </w:drawing>
+      </w:r>
+    </w:p>
+    <w:p>
+      <w:pPr>
+        <w:spacing w:after="200"/>
+        <w:jc w:val="center"/>
+      </w:pPr>
+      <w:r>
+        <w:rPr>
+          <w:rFonts w:ascii="Times New Roman" w:hAnsi="Times New Roman"/>
+          <w:i/>
+          <w:sz w:val="20"/>
+        </w:rPr>
+        <w:t>Figure 3. County choropleth of the food-specific gap; it ranks counties differently from the general gap, so food-sector triage reads this map.</w:t>
+      </w:r>
+    </w:p>
+    <w:p>
+      <w:pPr>
+        <w:spacing w:before="120"/>
+        <w:jc w:val="center"/>
+      </w:pPr>
+      <w:r>
+        <w:drawing>
+          <wp:inline xmlns:a="http://schemas.openxmlformats.org/drawingml/2006/main" xmlns:pic="http://schemas.openxmlformats.org/drawingml/2006/picture">
+            <wp:extent cx="5760720" cy="1985113"/>
+            <wp:docPr id="4" name="Picture 4"/>
+            <wp:cNvGraphicFramePr>
+              <a:graphicFrameLocks noChangeAspect="1"/>
+            </wp:cNvGraphicFramePr>
+            <a:graphic>
+              <a:graphicData uri="http://schemas.openxmlformats.org/drawingml/2006/picture">
+                <pic:pic>
+                  <pic:nvPicPr>
+                    <pic:cNvPr id="0" name="gap_cartogram_states.png"/>
+                    <pic:cNvPicPr/>
+                  </pic:nvPicPr>
+                  <pic:blipFill>
+                    <a:blip r:embed="rId12"/>
+                    <a:stretch>
+                      <a:fillRect/>
+                    </a:stretch>
+                  </pic:blipFill>
+                  <pic:spPr>
+                    <a:xfrm>
+                      <a:off x="0" y="0"/>
+                      <a:ext cx="5760720" cy="1985113"/>
+                    </a:xfrm>
+                    <a:prstGeom prst="rect"/>
+                  </pic:spPr>
+                </pic:pic>
+              </a:graphicData>
+            </a:graphic>
+          </wp:inline>
+        </w:drawing>
+      </w:r>
+    </w:p>
+    <w:p>
+      <w:pPr>
+        <w:spacing w:after="200"/>
+        <w:jc w:val="center"/>
+      </w:pPr>
+      <w:r>
+        <w:rPr>
+          <w:rFonts w:ascii="Times New Roman" w:hAnsi="Times New Roman"/>
+          <w:i/>
+          <w:sz w:val="20"/>
+        </w:rPr>
+        <w:t>Figure 4. State-mean tile cartogram of the general and food gaps, an at-a-glance companion to the county maps.</w:t>
+      </w:r>
+    </w:p>
+    <w:p>
+      <w:pPr>
+        <w:spacing w:before="120"/>
+        <w:jc w:val="center"/>
+      </w:pPr>
+      <w:r>
+        <w:drawing>
+          <wp:inline xmlns:a="http://schemas.openxmlformats.org/drawingml/2006/main" xmlns:pic="http://schemas.openxmlformats.org/drawingml/2006/picture">
+            <wp:extent cx="5760720" cy="4207267"/>
+            <wp:docPr id="5" name="Picture 5"/>
+            <wp:cNvGraphicFramePr>
+              <a:graphicFrameLocks noChangeAspect="1"/>
+            </wp:cNvGraphicFramePr>
+            <a:graphic>
+              <a:graphicData uri="http://schemas.openxmlformats.org/drawingml/2006/picture">
+                <pic:pic>
+                  <pic:nvPicPr>
+                    <pic:cNvPr id="0" name="need_vs_capacity.png"/>
+                    <pic:cNvPicPr/>
+                  </pic:nvPicPr>
+                  <pic:blipFill>
+                    <a:blip r:embed="rId13"/>
+                    <a:stretch>
+                      <a:fillRect/>
+                    </a:stretch>
+                  </pic:blipFill>
+                  <pic:spPr>
+                    <a:xfrm>
+                      <a:off x="0" y="0"/>
+                      <a:ext cx="5760720" cy="4207267"/>
+                    </a:xfrm>
+                    <a:prstGeom prst="rect"/>
+                  </pic:spPr>
+                </pic:pic>
+              </a:graphicData>
+            </a:graphic>
+          </wp:inline>
+        </w:drawing>
+      </w:r>
+    </w:p>
+    <w:p>
+      <w:pPr>
+        <w:spacing w:after="200"/>
+        <w:jc w:val="center"/>
+      </w:pPr>
+      <w:r>
+        <w:rPr>
+          <w:rFonts w:ascii="Times New Roman" w:hAnsi="Times New Roman"/>
+          <w:i/>
+          <w:sz w:val="20"/>
+        </w:rPr>
+        <w:t>Figure 5. Need versus capacity for all 3,066 counties; the top-gap counties (red) sit far above the gap = 0 diagonal.</w:t>
+      </w:r>
+    </w:p>
+    <w:p>
+      <w:pPr>
+        <w:spacing w:before="120"/>
+        <w:jc w:val="center"/>
+      </w:pPr>
+      <w:r>
+        <w:drawing>
+          <wp:inline xmlns:a="http://schemas.openxmlformats.org/drawingml/2006/main" xmlns:pic="http://schemas.openxmlformats.org/drawingml/2006/picture">
+            <wp:extent cx="5760720" cy="3632662"/>
+            <wp:docPr id="6" name="Picture 6"/>
+            <wp:cNvGraphicFramePr>
+              <a:graphicFrameLocks noChangeAspect="1"/>
+            </wp:cNvGraphicFramePr>
+            <a:graphic>
+              <a:graphicData uri="http://schemas.openxmlformats.org/drawingml/2006/picture">
+                <pic:pic>
+                  <pic:nvPicPr>
+                    <pic:cNvPr id="0" name="gap_distribution.png"/>
+                    <pic:cNvPicPr/>
+                  </pic:nvPicPr>
+                  <pic:blipFill>
+                    <a:blip r:embed="rId14"/>
+                    <a:stretch>
+                      <a:fillRect/>
+                    </a:stretch>
+                  </pic:blipFill>
+                  <pic:spPr>
+                    <a:xfrm>
+                      <a:off x="0" y="0"/>
+                      <a:ext cx="5760720" cy="3632662"/>
+                    </a:xfrm>
+                    <a:prstGeom prst="rect"/>
+                  </pic:spPr>
+                </pic:pic>
+              </a:graphicData>
+            </a:graphic>
+          </wp:inline>
+        </w:drawing>
+      </w:r>
+    </w:p>
+    <w:p>
+      <w:pPr>
+        <w:spacing w:after="200"/>
+        <w:jc w:val="center"/>
+      </w:pPr>
+      <w:r>
+        <w:rPr>
+          <w:rFonts w:ascii="Times New Roman" w:hAnsi="Times New Roman"/>
+          <w:i/>
+          <w:sz w:val="20"/>
+        </w:rPr>
+        <w:t>Figure 6. Gap-score distribution across the 3,066 counties; nearly symmetric, so the high-gap counties are genuine tail cases.</w:t>
+      </w:r>
+    </w:p>
+    <w:p>
+      <w:pPr>
+        <w:spacing w:before="120"/>
+        <w:jc w:val="center"/>
+      </w:pPr>
+      <w:r>
+        <w:drawing>
+          <wp:inline xmlns:a="http://schemas.openxmlformats.org/drawingml/2006/main" xmlns:pic="http://schemas.openxmlformats.org/drawingml/2006/picture">
+            <wp:extent cx="5760720" cy="3921772"/>
+            <wp:docPr id="7" name="Picture 7"/>
+            <wp:cNvGraphicFramePr>
+              <a:graphicFrameLocks noChangeAspect="1"/>
+            </wp:cNvGraphicFramePr>
+            <a:graphic>
+              <a:graphicData uri="http://schemas.openxmlformats.org/drawingml/2006/picture">
+                <pic:pic>
+                  <pic:nvPicPr>
+                    <pic:cNvPr id="0" name="correlation_heatmap.png"/>
+                    <pic:cNvPicPr/>
+                  </pic:nvPicPr>
+                  <pic:blipFill>
+                    <a:blip r:embed="rId15"/>
+                    <a:stretch>
+                      <a:fillRect/>
+                    </a:stretch>
+                  </pic:blipFill>
+                  <pic:spPr>
+                    <a:xfrm>
+                      <a:off x="0" y="0"/>
+                      <a:ext cx="5760720" cy="3921772"/>
+                    </a:xfrm>
+                    <a:prstGeom prst="rect"/>
+                  </pic:spPr>
+                </pic:pic>
+              </a:graphicData>
+            </a:graphic>
+          </wp:inline>
+        </w:drawing>
+      </w:r>
+    </w:p>
+    <w:p>
+      <w:pPr>
+        <w:spacing w:after="200"/>
+        <w:jc w:val="center"/>
+      </w:pPr>
+      <w:r>
+        <w:rPr>
+          <w:rFonts w:ascii="Times New Roman" w:hAnsi="Times New Roman"/>
+          <w:i/>
+          <w:sz w:val="20"/>
+        </w:rPr>
+        <w:t>Figure 7. The exhaustive need-by-capacity Spearman grid the critic operates on; only cells clearing FDR, the permutation test, and the effect floor are graded supported.</w:t>
+      </w:r>
+    </w:p>
+    <w:p>
+      <w:pPr>
+        <w:spacing w:before="120"/>
+        <w:jc w:val="center"/>
+      </w:pPr>
+      <w:r>
+        <w:drawing>
+          <wp:inline xmlns:a="http://schemas.openxmlformats.org/drawingml/2006/main" xmlns:pic="http://schemas.openxmlformats.org/drawingml/2006/picture">
+            <wp:extent cx="3735692" cy="5852159"/>
+            <wp:docPr id="8" name="Picture 8"/>
+            <wp:cNvGraphicFramePr>
+              <a:graphicFrameLocks noChangeAspect="1"/>
+            </wp:cNvGraphicFramePr>
+            <a:graphic>
+              <a:graphicData uri="http://schemas.openxmlformats.org/drawingml/2006/picture">
+                <pic:pic>
+                  <pic:nvPicPr>
+                    <pic:cNvPr id="0" name="truncation_bias.png"/>
+                    <pic:cNvPicPr/>
+                  </pic:nvPicPr>
+                  <pic:blipFill>
+                    <a:blip r:embed="rId16"/>
+                    <a:stretch>
+                      <a:fillRect/>
+                    </a:stretch>
+                  </pic:blipFill>
+                  <pic:spPr>
+                    <a:xfrm>
+                      <a:off x="0" y="0"/>
+                      <a:ext cx="3735692" cy="5852159"/>
+                    </a:xfrm>
+                    <a:prstGeom prst="rect"/>
+                  </pic:spPr>
+                </pic:pic>
+              </a:graphicData>
+            </a:graphic>
+          </wp:inline>
+        </w:drawing>
+      </w:r>
+    </w:p>
+    <w:p>
+      <w:pPr>
+        <w:spacing w:after="200"/>
+        <w:jc w:val="center"/>
+      </w:pPr>
+      <w:r>
+        <w:rPr>
+          <w:rFonts w:ascii="Times New Roman" w:hAnsi="Times New Roman"/>
+          <w:i/>
+          <w:sz w:val="20"/>
+        </w:rPr>
+        <w:t>Figure 8. Per-state coverage of the retired truncated extract against the full table; the EIN-sorted cut was geographically structured, not random.</w:t>
       </w:r>
     </w:p>
     <w:p>

</xml_diff>

<commit_message>
changes to ppt and report
</commit_message>
<xml_diff>
--- a/CS6365_Checkpoint4_Report.docx
+++ b/CS6365_Checkpoint4_Report.docx
@@ -434,7 +434,7 @@
           <w:b w:val="0"/>
           <w:sz w:val="22"/>
         </w:rPr>
-        <w:t>Need Score is the mean z-score of the available need indicators (poverty rate, food-desert percentage, housing burden). Capacity Score is the mean z-score of the per-capita capacity indicators (nonprofits per 10k residents, revenue per capita, assets per capita), each first put through a signed-log transform so that a single large nonprofit cannot dominate a county's score. Gap Score is Need Score minus Capacity Score; a high gap means need outpaces capacity. A food-specific food_gap_score measures food-related need against food-sector nonprofit density. Missing financials are recorded as missing (NaN), never as a fabricated zero. All scores are triage signals worth investigating, not causal claims about nonprofit performance.</w:t>
+        <w:t>Need Score is the mean z-score of the available need indicators (poverty rate, food-desert percentage, housing burden). Capacity Score is the mean z-score of the per-capita capacity indicators (nonprofits per 10k residents, revenue per capita, assets per capita), each first put through a signed-log transform so that a single large nonprofit cannot dominate a county's score. Gap Score is Need Score minus Capacity Score; a high gap means need outpaces capacity. A food-specific food_gap_score measures food-related need against food-sector nonprofit density; the two rankings are related but meaningfully different (rank rho = 0.58; 0 of the top 10 counties overlap), so both are reported and food-sector triage should read food_gap_score. The two Checkpoint 3 data-validity fixes carry forward on the full data: the 990 filings are deduplicated to one filing per EIN (latest year, largest-revenue tie-break) rather than summed, and counties with no matched filer are recorded as missing (NaN), never as a fabricated zero. All scores are triage signals worth investigating, not causal claims about nonprofit performance.</w:t>
       </w:r>
     </w:p>
     <w:p>
@@ -2059,7 +2059,7 @@
           <w:b w:val="0"/>
           <w:sz w:val="22"/>
         </w:rPr>
-        <w:t>Gap distribution: median -0.01, standard deviation 1.09, range -4.56 to +4.17; direction checks pass (gap versus poverty positive, gap versus nonprofit density negative).</w:t>
+        <w:t>Gap distribution: median -0.01, standard deviation 1.09, range -4.56 to +4.17; direction checks pass (corr(gap, poverty) = +0.57, corr(gap, nonprofit density) = -0.54).</w:t>
       </w:r>
     </w:p>
     <w:p>

</xml_diff>